<commit_message>
refine geo tracking methodology and outputs
</commit_message>
<xml_diff>
--- a/skills/geo-tracking-plan/examples/hubspot-demo/hubspot-geo-tracking-plan.docx
+++ b/skills/geo-tracking-plan/examples/hubspot-demo/hubspot-geo-tracking-plan.docx
@@ -1059,7 +1059,44 @@
           <w:szCs w:val="56"/>
           <w:b/>
         </w:rPr>
-        <w:t xml:space="preserve">直接效果追踪方案</w:t>
+        <w:t xml:space="preserve">效果追踪方法与原理说明</w:t>
+      </w:r>
+    </w:p>
+    <w:p>
+      <w:pPr>
+        <w:spacing w:before="0" w:after="120"/>
+      </w:pPr>
+      <w:r>
+        <w:rPr>
+          <w:sz w:val="42"/>
+          <w:szCs w:val="42"/>
+        </w:rPr>
+        <w:t xml:space="preserve">该示例把 GEO 价值拆成两个总层面：品牌层价值与效果转化层价值。品牌层价值来自 AI 推荐带来的第三方背书，会提升品牌可信度、默认候选心智和后续主动搜索意愿；效果转化层价值则继续拆成可直接监测的结果与间接促进的结果。</w:t>
+      </w:r>
+    </w:p>
+    <w:p>
+      <w:pPr>
+        <w:spacing w:before="0" w:after="120"/>
+      </w:pPr>
+      <w:r>
+        <w:rPr>
+          <w:sz w:val="42"/>
+          <w:szCs w:val="42"/>
+        </w:rPr>
+        <w:t xml:space="preserve">对 HubSpot 这类海外 SaaS，公司官网本身就是主承接阵地，因此可以更强依赖产品页、注册页、表单字段、页面事件和升级链路来做归因聚合；但即便如此，仍然不能假设所有 GEO 贡献都能被直接统计。</w:t>
+      </w:r>
+    </w:p>
+    <w:p>
+      <w:pPr>
+        <w:spacing w:before="0" w:after="100"/>
+      </w:pPr>
+      <w:r>
+        <w:rPr>
+          <w:sz w:val="44"/>
+          <w:szCs w:val="44"/>
+          <w:b/>
+        </w:rPr>
+        <w:t xml:space="preserve">海外 GEO 承接与归因链路图示</w:t>
       </w:r>
     </w:p>
     <w:tbl>
@@ -1077,7 +1114,7 @@
       <w:tr>
         <w:tc>
           <w:tcPr>
-            <w:tcW w:w="2250" w:type="dxa"/>
+            <w:tcW w:w="3000" w:type="dxa"/>
           </w:tcPr>
           <w:p>
             <w:pPr>
@@ -1089,13 +1126,13 @@
                 <w:szCs w:val="20"/>
                 <w:b/>
               </w:rPr>
-              <w:t xml:space="preserve">监测动作</w:t>
-            </w:r>
-          </w:p>
-        </w:tc>
-        <w:tc>
-          <w:tcPr>
-            <w:tcW w:w="2250" w:type="dxa"/>
+              <w:t xml:space="preserve">阶段</w:t>
+            </w:r>
+          </w:p>
+        </w:tc>
+        <w:tc>
+          <w:tcPr>
+            <w:tcW w:w="3000" w:type="dxa"/>
           </w:tcPr>
           <w:p>
             <w:pPr>
@@ -1107,13 +1144,13 @@
                 <w:szCs w:val="20"/>
                 <w:b/>
               </w:rPr>
-              <w:t xml:space="preserve">实现方式</w:t>
-            </w:r>
-          </w:p>
-        </w:tc>
-        <w:tc>
-          <w:tcPr>
-            <w:tcW w:w="2250" w:type="dxa"/>
+              <w:t xml:space="preserve">步骤</w:t>
+            </w:r>
+          </w:p>
+        </w:tc>
+        <w:tc>
+          <w:tcPr>
+            <w:tcW w:w="3000" w:type="dxa"/>
           </w:tcPr>
           <w:p>
             <w:pPr>
@@ -1125,323 +1162,277 @@
                 <w:szCs w:val="20"/>
                 <w:b/>
               </w:rPr>
-              <w:t xml:space="preserve">适配理由</w:t>
-            </w:r>
-          </w:p>
-        </w:tc>
-        <w:tc>
-          <w:tcPr>
-            <w:tcW w:w="2250" w:type="dxa"/>
-          </w:tcPr>
-          <w:p>
-            <w:pPr>
-              <w:spacing w:before="60" w:after="60"/>
-            </w:pPr>
-            <w:r>
-              <w:rPr>
-                <w:sz w:val="20"/>
-                <w:szCs w:val="20"/>
-                <w:b/>
-              </w:rPr>
-              <w:t xml:space="preserve">优先级</w:t>
-            </w:r>
-          </w:p>
-        </w:tc>
-      </w:tr>
-      <w:tr>
-        <w:tc>
-          <w:tcPr>
-            <w:tcW w:w="2250" w:type="dxa"/>
-          </w:tcPr>
-          <w:p>
-            <w:pPr>
-              <w:spacing w:before="60" w:after="60"/>
-            </w:pPr>
-            <w:r>
-              <w:rPr>
-                <w:sz w:val="20"/>
-                <w:szCs w:val="20"/>
-              </w:rPr>
-              <w:t xml:space="preserve">GEO 专属注册页</w:t>
-            </w:r>
-          </w:p>
-        </w:tc>
-        <w:tc>
-          <w:tcPr>
-            <w:tcW w:w="2250" w:type="dxa"/>
-          </w:tcPr>
-          <w:p>
-            <w:pPr>
-              <w:spacing w:before="60" w:after="60"/>
-            </w:pPr>
-            <w:r>
-              <w:rPr>
-                <w:sz w:val="20"/>
-                <w:szCs w:val="20"/>
-              </w:rPr>
-              <w:t xml:space="preserve">围绕 CRM、Marketing、Sales 三条主题分别建设专属 GEO 承接页，并绑定统一表单字段。</w:t>
-            </w:r>
-          </w:p>
-        </w:tc>
-        <w:tc>
-          <w:tcPr>
-            <w:tcW w:w="2250" w:type="dxa"/>
-          </w:tcPr>
-          <w:p>
-            <w:pPr>
-              <w:spacing w:before="60" w:after="60"/>
-            </w:pPr>
-            <w:r>
-              <w:rPr>
-                <w:sz w:val="20"/>
-                <w:szCs w:val="20"/>
-              </w:rPr>
-              <w:t xml:space="preserve">便于将 AI 触发的高意向需求和普通自然访问分开。</w:t>
-            </w:r>
-          </w:p>
-        </w:tc>
-        <w:tc>
-          <w:tcPr>
-            <w:tcW w:w="2250" w:type="dxa"/>
-          </w:tcPr>
-          <w:p>
-            <w:pPr>
-              <w:spacing w:before="60" w:after="60"/>
-            </w:pPr>
-            <w:r>
-              <w:rPr>
-                <w:sz w:val="20"/>
-                <w:szCs w:val="20"/>
-              </w:rPr>
-              <w:t xml:space="preserve">P0</w:t>
-            </w:r>
-          </w:p>
-        </w:tc>
-      </w:tr>
-      <w:tr>
-        <w:tc>
-          <w:tcPr>
-            <w:tcW w:w="2250" w:type="dxa"/>
-          </w:tcPr>
-          <w:p>
-            <w:pPr>
-              <w:spacing w:before="60" w:after="60"/>
-            </w:pPr>
-            <w:r>
-              <w:rPr>
-                <w:sz w:val="20"/>
-                <w:szCs w:val="20"/>
-              </w:rPr>
-              <w:t xml:space="preserve">表单隐藏字段</w:t>
-            </w:r>
-          </w:p>
-        </w:tc>
-        <w:tc>
-          <w:tcPr>
-            <w:tcW w:w="2250" w:type="dxa"/>
-          </w:tcPr>
-          <w:p>
-            <w:pPr>
-              <w:spacing w:before="60" w:after="60"/>
-            </w:pPr>
-            <w:r>
-              <w:rPr>
-                <w:sz w:val="20"/>
-                <w:szCs w:val="20"/>
-              </w:rPr>
-              <w:t xml:space="preserve">新增 channel_group、ai_platform、keyword_theme、landing_page_id、offer_code。</w:t>
-            </w:r>
-          </w:p>
-        </w:tc>
-        <w:tc>
-          <w:tcPr>
-            <w:tcW w:w="2250" w:type="dxa"/>
-          </w:tcPr>
-          <w:p>
-            <w:pPr>
-              <w:spacing w:before="60" w:after="60"/>
-            </w:pPr>
-            <w:r>
-              <w:rPr>
-                <w:sz w:val="20"/>
-                <w:szCs w:val="20"/>
-              </w:rPr>
-              <w:t xml:space="preserve">为后续注册、激活、升级归因提供主键。</w:t>
-            </w:r>
-          </w:p>
-        </w:tc>
-        <w:tc>
-          <w:tcPr>
-            <w:tcW w:w="2250" w:type="dxa"/>
-          </w:tcPr>
-          <w:p>
-            <w:pPr>
-              <w:spacing w:before="60" w:after="60"/>
-            </w:pPr>
-            <w:r>
-              <w:rPr>
-                <w:sz w:val="20"/>
-                <w:szCs w:val="20"/>
-              </w:rPr>
-              <w:t xml:space="preserve">P0</w:t>
-            </w:r>
-          </w:p>
-        </w:tc>
-      </w:tr>
-      <w:tr>
-        <w:tc>
-          <w:tcPr>
-            <w:tcW w:w="2250" w:type="dxa"/>
-          </w:tcPr>
-          <w:p>
-            <w:pPr>
-              <w:spacing w:before="60" w:after="60"/>
-            </w:pPr>
-            <w:r>
-              <w:rPr>
-                <w:sz w:val="20"/>
-                <w:szCs w:val="20"/>
-              </w:rPr>
-              <w:t xml:space="preserve">AI 专属权益包</w:t>
-            </w:r>
-          </w:p>
-        </w:tc>
-        <w:tc>
-          <w:tcPr>
-            <w:tcW w:w="2250" w:type="dxa"/>
-          </w:tcPr>
-          <w:p>
-            <w:pPr>
-              <w:spacing w:before="60" w:after="60"/>
-            </w:pPr>
-            <w:r>
-              <w:rPr>
-                <w:sz w:val="20"/>
-                <w:szCs w:val="20"/>
-              </w:rPr>
-              <w:t xml:space="preserve">为 AI 流量提供独立模板包、诊断包或试用权益码。</w:t>
-            </w:r>
-          </w:p>
-        </w:tc>
-        <w:tc>
-          <w:tcPr>
-            <w:tcW w:w="2250" w:type="dxa"/>
-          </w:tcPr>
-          <w:p>
-            <w:pPr>
-              <w:spacing w:before="60" w:after="60"/>
-            </w:pPr>
-            <w:r>
-              <w:rPr>
-                <w:sz w:val="20"/>
-                <w:szCs w:val="20"/>
-              </w:rPr>
-              <w:t xml:space="preserve">适合对来源字段缺失做低成本补丁。</w:t>
-            </w:r>
-          </w:p>
-        </w:tc>
-        <w:tc>
-          <w:tcPr>
-            <w:tcW w:w="2250" w:type="dxa"/>
-          </w:tcPr>
-          <w:p>
-            <w:pPr>
-              <w:spacing w:before="60" w:after="60"/>
-            </w:pPr>
-            <w:r>
-              <w:rPr>
-                <w:sz w:val="20"/>
-                <w:szCs w:val="20"/>
-              </w:rPr>
-              <w:t xml:space="preserve">P1</w:t>
-            </w:r>
-          </w:p>
-        </w:tc>
-      </w:tr>
-      <w:tr>
-        <w:tc>
-          <w:tcPr>
-            <w:tcW w:w="2250" w:type="dxa"/>
-          </w:tcPr>
-          <w:p>
-            <w:pPr>
-              <w:spacing w:before="60" w:after="60"/>
-            </w:pPr>
-            <w:r>
-              <w:rPr>
-                <w:sz w:val="20"/>
-                <w:szCs w:val="20"/>
-              </w:rPr>
-              <w:t xml:space="preserve">演示预约分流</w:t>
-            </w:r>
-          </w:p>
-        </w:tc>
-        <w:tc>
-          <w:tcPr>
-            <w:tcW w:w="2250" w:type="dxa"/>
-          </w:tcPr>
-          <w:p>
-            <w:pPr>
-              <w:spacing w:before="60" w:after="60"/>
-            </w:pPr>
-            <w:r>
-              <w:rPr>
-                <w:sz w:val="20"/>
-                <w:szCs w:val="20"/>
-              </w:rPr>
-              <w:t xml:space="preserve">给高意向 GEO 页面加入专属 demo CTA 与日历入口。</w:t>
-            </w:r>
-          </w:p>
-        </w:tc>
-        <w:tc>
-          <w:tcPr>
-            <w:tcW w:w="2250" w:type="dxa"/>
-          </w:tcPr>
-          <w:p>
-            <w:pPr>
-              <w:spacing w:before="60" w:after="60"/>
-            </w:pPr>
-            <w:r>
-              <w:rPr>
-                <w:sz w:val="20"/>
-                <w:szCs w:val="20"/>
-              </w:rPr>
-              <w:t xml:space="preserve">方便把销售协同型转化和自助型注册拆开。</w:t>
-            </w:r>
-          </w:p>
-        </w:tc>
-        <w:tc>
-          <w:tcPr>
-            <w:tcW w:w="2250" w:type="dxa"/>
-          </w:tcPr>
-          <w:p>
-            <w:pPr>
-              <w:spacing w:before="60" w:after="60"/>
-            </w:pPr>
-            <w:r>
-              <w:rPr>
-                <w:sz w:val="20"/>
-                <w:szCs w:val="20"/>
-              </w:rPr>
-              <w:t xml:space="preserve">P1</w:t>
+              <w:t xml:space="preserve">说明</w:t>
+            </w:r>
+          </w:p>
+        </w:tc>
+      </w:tr>
+      <w:tr>
+        <w:tc>
+          <w:tcPr>
+            <w:tcW w:w="3000" w:type="dxa"/>
+          </w:tcPr>
+          <w:p>
+            <w:pPr>
+              <w:spacing w:before="60" w:after="60"/>
+            </w:pPr>
+            <w:r>
+              <w:rPr>
+                <w:sz w:val="20"/>
+                <w:szCs w:val="20"/>
+              </w:rPr>
+              <w:t xml:space="preserve">Step 1</w:t>
+            </w:r>
+          </w:p>
+        </w:tc>
+        <w:tc>
+          <w:tcPr>
+            <w:tcW w:w="3000" w:type="dxa"/>
+          </w:tcPr>
+          <w:p>
+            <w:pPr>
+              <w:spacing w:before="60" w:after="60"/>
+            </w:pPr>
+            <w:r>
+              <w:rPr>
+                <w:sz w:val="20"/>
+                <w:szCs w:val="20"/>
+              </w:rPr>
+              <w:t xml:space="preserve">AI 平台展示品牌</w:t>
+            </w:r>
+          </w:p>
+        </w:tc>
+        <w:tc>
+          <w:tcPr>
+            <w:tcW w:w="3000" w:type="dxa"/>
+          </w:tcPr>
+          <w:p>
+            <w:pPr>
+              <w:spacing w:before="60" w:after="60"/>
+            </w:pPr>
+            <w:r>
+              <w:rPr>
+                <w:sz w:val="20"/>
+                <w:szCs w:val="20"/>
+              </w:rPr>
+              <w:t xml:space="preserve">在 ChatGPT、Gemini 等平台中被推荐、引用或对比展示，形成品牌背书。</w:t>
+            </w:r>
+          </w:p>
+        </w:tc>
+      </w:tr>
+      <w:tr>
+        <w:tc>
+          <w:tcPr>
+            <w:tcW w:w="3000" w:type="dxa"/>
+          </w:tcPr>
+          <w:p>
+            <w:pPr>
+              <w:spacing w:before="60" w:after="60"/>
+            </w:pPr>
+            <w:r>
+              <w:rPr>
+                <w:sz w:val="20"/>
+                <w:szCs w:val="20"/>
+              </w:rPr>
+              <w:t xml:space="preserve">Step 2</w:t>
+            </w:r>
+          </w:p>
+        </w:tc>
+        <w:tc>
+          <w:tcPr>
+            <w:tcW w:w="3000" w:type="dxa"/>
+          </w:tcPr>
+          <w:p>
+            <w:pPr>
+              <w:spacing w:before="60" w:after="60"/>
+            </w:pPr>
+            <w:r>
+              <w:rPr>
+                <w:sz w:val="20"/>
+                <w:szCs w:val="20"/>
+              </w:rPr>
+              <w:t xml:space="preserve">访问官网或主题页</w:t>
+            </w:r>
+          </w:p>
+        </w:tc>
+        <w:tc>
+          <w:tcPr>
+            <w:tcW w:w="3000" w:type="dxa"/>
+          </w:tcPr>
+          <w:p>
+            <w:pPr>
+              <w:spacing w:before="60" w:after="60"/>
+            </w:pPr>
+            <w:r>
+              <w:rPr>
+                <w:sz w:val="20"/>
+                <w:szCs w:val="20"/>
+              </w:rPr>
+              <w:t xml:space="preserve">用户进入产品页、资源页、注册页或定价页，开始留下可回传的页面与来源信号。</w:t>
+            </w:r>
+          </w:p>
+        </w:tc>
+      </w:tr>
+      <w:tr>
+        <w:tc>
+          <w:tcPr>
+            <w:tcW w:w="3000" w:type="dxa"/>
+          </w:tcPr>
+          <w:p>
+            <w:pPr>
+              <w:spacing w:before="60" w:after="60"/>
+            </w:pPr>
+            <w:r>
+              <w:rPr>
+                <w:sz w:val="20"/>
+                <w:szCs w:val="20"/>
+              </w:rPr>
+              <w:t xml:space="preserve">Step 3</w:t>
+            </w:r>
+          </w:p>
+        </w:tc>
+        <w:tc>
+          <w:tcPr>
+            <w:tcW w:w="3000" w:type="dxa"/>
+          </w:tcPr>
+          <w:p>
+            <w:pPr>
+              <w:spacing w:before="60" w:after="60"/>
+            </w:pPr>
+            <w:r>
+              <w:rPr>
+                <w:sz w:val="20"/>
+                <w:szCs w:val="20"/>
+              </w:rPr>
+              <w:t xml:space="preserve">表单与 CTA 识别来源</w:t>
+            </w:r>
+          </w:p>
+        </w:tc>
+        <w:tc>
+          <w:tcPr>
+            <w:tcW w:w="3000" w:type="dxa"/>
+          </w:tcPr>
+          <w:p>
+            <w:pPr>
+              <w:spacing w:before="60" w:after="60"/>
+            </w:pPr>
+            <w:r>
+              <w:rPr>
+                <w:sz w:val="20"/>
+                <w:szCs w:val="20"/>
+              </w:rPr>
+              <w:t xml:space="preserve">通过 landing_page_id、ai_platform、keyword_theme、offer_code 等字段把高意向访问写入线索主键。</w:t>
+            </w:r>
+          </w:p>
+        </w:tc>
+      </w:tr>
+      <w:tr>
+        <w:tc>
+          <w:tcPr>
+            <w:tcW w:w="3000" w:type="dxa"/>
+          </w:tcPr>
+          <w:p>
+            <w:pPr>
+              <w:spacing w:before="60" w:after="60"/>
+            </w:pPr>
+            <w:r>
+              <w:rPr>
+                <w:sz w:val="20"/>
+                <w:szCs w:val="20"/>
+              </w:rPr>
+              <w:t xml:space="preserve">Step 4</w:t>
+            </w:r>
+          </w:p>
+        </w:tc>
+        <w:tc>
+          <w:tcPr>
+            <w:tcW w:w="3000" w:type="dxa"/>
+          </w:tcPr>
+          <w:p>
+            <w:pPr>
+              <w:spacing w:before="60" w:after="60"/>
+            </w:pPr>
+            <w:r>
+              <w:rPr>
+                <w:sz w:val="20"/>
+                <w:szCs w:val="20"/>
+              </w:rPr>
+              <w:t xml:space="preserve">激活与升级回传</w:t>
+            </w:r>
+          </w:p>
+        </w:tc>
+        <w:tc>
+          <w:tcPr>
+            <w:tcW w:w="3000" w:type="dxa"/>
+          </w:tcPr>
+          <w:p>
+            <w:pPr>
+              <w:spacing w:before="60" w:after="60"/>
+            </w:pPr>
+            <w:r>
+              <w:rPr>
+                <w:sz w:val="20"/>
+                <w:szCs w:val="20"/>
+              </w:rPr>
+              <w:t xml:space="preserve">把注册、激活、演示预约和升级动作回传到统一来源字典中。</w:t>
+            </w:r>
+          </w:p>
+        </w:tc>
+      </w:tr>
+      <w:tr>
+        <w:tc>
+          <w:tcPr>
+            <w:tcW w:w="3000" w:type="dxa"/>
+          </w:tcPr>
+          <w:p>
+            <w:pPr>
+              <w:spacing w:before="60" w:after="60"/>
+            </w:pPr>
+            <w:r>
+              <w:rPr>
+                <w:sz w:val="20"/>
+                <w:szCs w:val="20"/>
+              </w:rPr>
+              <w:t xml:space="preserve">Step 5</w:t>
+            </w:r>
+          </w:p>
+        </w:tc>
+        <w:tc>
+          <w:tcPr>
+            <w:tcW w:w="3000" w:type="dxa"/>
+          </w:tcPr>
+          <w:p>
+            <w:pPr>
+              <w:spacing w:before="60" w:after="60"/>
+            </w:pPr>
+            <w:r>
+              <w:rPr>
+                <w:sz w:val="20"/>
+                <w:szCs w:val="20"/>
+              </w:rPr>
+              <w:t xml:space="preserve">品牌与转化联合复盘</w:t>
+            </w:r>
+          </w:p>
+        </w:tc>
+        <w:tc>
+          <w:tcPr>
+            <w:tcW w:w="3000" w:type="dxa"/>
+          </w:tcPr>
+          <w:p>
+            <w:pPr>
+              <w:spacing w:before="60" w:after="60"/>
+            </w:pPr>
+            <w:r>
+              <w:rPr>
+                <w:sz w:val="20"/>
+                <w:szCs w:val="20"/>
+              </w:rPr>
+              <w:t xml:space="preserve">将品牌词、UV、注册率、激活率和升级率一起解释，避免把 GEO 误读成单一流量渠道。</w:t>
             </w:r>
           </w:p>
         </w:tc>
       </w:tr>
     </w:tbl>
-    <w:p>
-      <w:pPr>
-        <w:spacing w:before="180" w:after="120"/>
-      </w:pPr>
-      <w:r>
-        <w:rPr>
-          <w:sz w:val="56"/>
-          <w:szCs w:val="56"/>
-          <w:b/>
-        </w:rPr>
-        <w:t xml:space="preserve">间接效果追踪方案</w:t>
-      </w:r>
-    </w:p>
     <w:tbl>
       <w:tblPr>
         <w:tblW w:w="0" w:type="auto"/>
@@ -1457,7 +1448,7 @@
       <w:tr>
         <w:tc>
           <w:tcPr>
-            <w:tcW w:w="1800" w:type="dxa"/>
+            <w:tcW w:w="2250" w:type="dxa"/>
           </w:tcPr>
           <w:p>
             <w:pPr>
@@ -1469,6 +1460,696 @@
                 <w:szCs w:val="20"/>
                 <w:b/>
               </w:rPr>
+              <w:t xml:space="preserve">价值层级</w:t>
+            </w:r>
+          </w:p>
+        </w:tc>
+        <w:tc>
+          <w:tcPr>
+            <w:tcW w:w="2250" w:type="dxa"/>
+          </w:tcPr>
+          <w:p>
+            <w:pPr>
+              <w:spacing w:before="60" w:after="60"/>
+            </w:pPr>
+            <w:r>
+              <w:rPr>
+                <w:sz w:val="20"/>
+                <w:szCs w:val="20"/>
+                <w:b/>
+              </w:rPr>
+              <w:t xml:space="preserve">监测原理</w:t>
+            </w:r>
+          </w:p>
+        </w:tc>
+        <w:tc>
+          <w:tcPr>
+            <w:tcW w:w="2250" w:type="dxa"/>
+          </w:tcPr>
+          <w:p>
+            <w:pPr>
+              <w:spacing w:before="60" w:after="60"/>
+            </w:pPr>
+            <w:r>
+              <w:rPr>
+                <w:sz w:val="20"/>
+                <w:szCs w:val="20"/>
+                <w:b/>
+              </w:rPr>
+              <w:t xml:space="preserve">适合方法</w:t>
+            </w:r>
+          </w:p>
+        </w:tc>
+        <w:tc>
+          <w:tcPr>
+            <w:tcW w:w="2250" w:type="dxa"/>
+          </w:tcPr>
+          <w:p>
+            <w:pPr>
+              <w:spacing w:before="60" w:after="60"/>
+            </w:pPr>
+            <w:r>
+              <w:rPr>
+                <w:sz w:val="20"/>
+                <w:szCs w:val="20"/>
+                <w:b/>
+              </w:rPr>
+              <w:t xml:space="preserve">执行动作建议</w:t>
+            </w:r>
+          </w:p>
+        </w:tc>
+      </w:tr>
+      <w:tr>
+        <w:tc>
+          <w:tcPr>
+            <w:tcW w:w="2250" w:type="dxa"/>
+          </w:tcPr>
+          <w:p>
+            <w:pPr>
+              <w:spacing w:before="60" w:after="60"/>
+            </w:pPr>
+            <w:r>
+              <w:rPr>
+                <w:sz w:val="20"/>
+                <w:szCs w:val="20"/>
+              </w:rPr>
+              <w:t xml:space="preserve">品牌层价值</w:t>
+            </w:r>
+          </w:p>
+        </w:tc>
+        <w:tc>
+          <w:tcPr>
+            <w:tcW w:w="2250" w:type="dxa"/>
+          </w:tcPr>
+          <w:p>
+            <w:pPr>
+              <w:spacing w:before="60" w:after="60"/>
+            </w:pPr>
+            <w:r>
+              <w:rPr>
+                <w:sz w:val="20"/>
+                <w:szCs w:val="20"/>
+              </w:rPr>
+              <w:t xml:space="preserve">AI 推荐会形成高信任度背书，并提升后续品牌搜索与主动访问概率。</w:t>
+            </w:r>
+          </w:p>
+        </w:tc>
+        <w:tc>
+          <w:tcPr>
+            <w:tcW w:w="2250" w:type="dxa"/>
+          </w:tcPr>
+          <w:p>
+            <w:pPr>
+              <w:spacing w:before="60" w:after="60"/>
+            </w:pPr>
+            <w:r>
+              <w:rPr>
+                <w:sz w:val="20"/>
+                <w:szCs w:val="20"/>
+              </w:rPr>
+              <w:t xml:space="preserve">品牌词检索量、直接访问、品牌页 UV、销售沟通反馈。</w:t>
+            </w:r>
+          </w:p>
+        </w:tc>
+        <w:tc>
+          <w:tcPr>
+            <w:tcW w:w="2250" w:type="dxa"/>
+          </w:tcPr>
+          <w:p>
+            <w:pPr>
+              <w:spacing w:before="60" w:after="60"/>
+            </w:pPr>
+            <w:r>
+              <w:rPr>
+                <w:sz w:val="20"/>
+                <w:szCs w:val="20"/>
+              </w:rPr>
+              <w:t xml:space="preserve">固定品牌词包，按周对比趋势，并结合 AI 平台重点主题复盘。</w:t>
+            </w:r>
+          </w:p>
+        </w:tc>
+      </w:tr>
+      <w:tr>
+        <w:tc>
+          <w:tcPr>
+            <w:tcW w:w="2250" w:type="dxa"/>
+          </w:tcPr>
+          <w:p>
+            <w:pPr>
+              <w:spacing w:before="60" w:after="60"/>
+            </w:pPr>
+            <w:r>
+              <w:rPr>
+                <w:sz w:val="20"/>
+                <w:szCs w:val="20"/>
+              </w:rPr>
+              <w:t xml:space="preserve">直接效果</w:t>
+            </w:r>
+          </w:p>
+        </w:tc>
+        <w:tc>
+          <w:tcPr>
+            <w:tcW w:w="2250" w:type="dxa"/>
+          </w:tcPr>
+          <w:p>
+            <w:pPr>
+              <w:spacing w:before="60" w:after="60"/>
+            </w:pPr>
+            <w:r>
+              <w:rPr>
+                <w:sz w:val="20"/>
+                <w:szCs w:val="20"/>
+              </w:rPr>
+              <w:t xml:space="preserve">把 AI 触发的访问尽可能写入官网注册、表单和升级主键。</w:t>
+            </w:r>
+          </w:p>
+        </w:tc>
+        <w:tc>
+          <w:tcPr>
+            <w:tcW w:w="2250" w:type="dxa"/>
+          </w:tcPr>
+          <w:p>
+            <w:pPr>
+              <w:spacing w:before="60" w:after="60"/>
+            </w:pPr>
+            <w:r>
+              <w:rPr>
+                <w:sz w:val="20"/>
+                <w:szCs w:val="20"/>
+              </w:rPr>
+              <w:t xml:space="preserve">referer / URL 参数、专属落地页、表单隐藏字段、专属权益码。</w:t>
+            </w:r>
+          </w:p>
+        </w:tc>
+        <w:tc>
+          <w:tcPr>
+            <w:tcW w:w="2250" w:type="dxa"/>
+          </w:tcPr>
+          <w:p>
+            <w:pPr>
+              <w:spacing w:before="60" w:after="60"/>
+            </w:pPr>
+            <w:r>
+              <w:rPr>
+                <w:sz w:val="20"/>
+                <w:szCs w:val="20"/>
+              </w:rPr>
+              <w:t xml:space="preserve">优先补字段和专属主题页，再打通注册、激活与升级回传。</w:t>
+            </w:r>
+          </w:p>
+        </w:tc>
+      </w:tr>
+      <w:tr>
+        <w:tc>
+          <w:tcPr>
+            <w:tcW w:w="2250" w:type="dxa"/>
+          </w:tcPr>
+          <w:p>
+            <w:pPr>
+              <w:spacing w:before="60" w:after="60"/>
+            </w:pPr>
+            <w:r>
+              <w:rPr>
+                <w:sz w:val="20"/>
+                <w:szCs w:val="20"/>
+              </w:rPr>
+              <w:t xml:space="preserve">间接效果</w:t>
+            </w:r>
+          </w:p>
+        </w:tc>
+        <w:tc>
+          <w:tcPr>
+            <w:tcW w:w="2250" w:type="dxa"/>
+          </w:tcPr>
+          <w:p>
+            <w:pPr>
+              <w:spacing w:before="60" w:after="60"/>
+            </w:pPr>
+            <w:r>
+              <w:rPr>
+                <w:sz w:val="20"/>
+                <w:szCs w:val="20"/>
+              </w:rPr>
+              <w:t xml:space="preserve">GEO 会通过品牌心智和内容承接提升中间转化，而非只增加一次访问。</w:t>
+            </w:r>
+          </w:p>
+        </w:tc>
+        <w:tc>
+          <w:tcPr>
+            <w:tcW w:w="2250" w:type="dxa"/>
+          </w:tcPr>
+          <w:p>
+            <w:pPr>
+              <w:spacing w:before="60" w:after="60"/>
+            </w:pPr>
+            <w:r>
+              <w:rPr>
+                <w:sz w:val="20"/>
+                <w:szCs w:val="20"/>
+              </w:rPr>
+              <w:t xml:space="preserve">UV、CTA 点击率、注册率、激活率、升级率、自报来源。</w:t>
+            </w:r>
+          </w:p>
+        </w:tc>
+        <w:tc>
+          <w:tcPr>
+            <w:tcW w:w="2250" w:type="dxa"/>
+          </w:tcPr>
+          <w:p>
+            <w:pPr>
+              <w:spacing w:before="60" w:after="60"/>
+            </w:pPr>
+            <w:r>
+              <w:rPr>
+                <w:sz w:val="20"/>
+                <w:szCs w:val="20"/>
+              </w:rPr>
+              <w:t xml:space="preserve">把主题页表现和销售协同路径一起纳入周报，而不是只看流量。</w:t>
+            </w:r>
+          </w:p>
+        </w:tc>
+      </w:tr>
+    </w:tbl>
+    <w:p>
+      <w:pPr>
+        <w:spacing w:before="180" w:after="120"/>
+      </w:pPr>
+      <w:r>
+        <w:rPr>
+          <w:sz w:val="56"/>
+          <w:szCs w:val="56"/>
+          <w:b/>
+        </w:rPr>
+        <w:t xml:space="preserve">直接效果追踪方案</w:t>
+      </w:r>
+    </w:p>
+    <w:tbl>
+      <w:tblPr>
+        <w:tblW w:w="0" w:type="auto"/>
+        <w:tblBorders>
+          <w:top w:val="single" w:sz="8" w:space="0" w:color="D7DFE8"/>
+          <w:left w:val="single" w:sz="8" w:space="0" w:color="D7DFE8"/>
+          <w:bottom w:val="single" w:sz="8" w:space="0" w:color="D7DFE8"/>
+          <w:right w:val="single" w:sz="8" w:space="0" w:color="D7DFE8"/>
+          <w:insideH w:val="single" w:sz="8" w:space="0" w:color="D7DFE8"/>
+          <w:insideV w:val="single" w:sz="8" w:space="0" w:color="D7DFE8"/>
+        </w:tblBorders>
+      </w:tblPr>
+      <w:tr>
+        <w:tc>
+          <w:tcPr>
+            <w:tcW w:w="2250" w:type="dxa"/>
+          </w:tcPr>
+          <w:p>
+            <w:pPr>
+              <w:spacing w:before="60" w:after="60"/>
+            </w:pPr>
+            <w:r>
+              <w:rPr>
+                <w:sz w:val="20"/>
+                <w:szCs w:val="20"/>
+                <w:b/>
+              </w:rPr>
+              <w:t xml:space="preserve">监测动作</w:t>
+            </w:r>
+          </w:p>
+        </w:tc>
+        <w:tc>
+          <w:tcPr>
+            <w:tcW w:w="2250" w:type="dxa"/>
+          </w:tcPr>
+          <w:p>
+            <w:pPr>
+              <w:spacing w:before="60" w:after="60"/>
+            </w:pPr>
+            <w:r>
+              <w:rPr>
+                <w:sz w:val="20"/>
+                <w:szCs w:val="20"/>
+                <w:b/>
+              </w:rPr>
+              <w:t xml:space="preserve">实现方式</w:t>
+            </w:r>
+          </w:p>
+        </w:tc>
+        <w:tc>
+          <w:tcPr>
+            <w:tcW w:w="2250" w:type="dxa"/>
+          </w:tcPr>
+          <w:p>
+            <w:pPr>
+              <w:spacing w:before="60" w:after="60"/>
+            </w:pPr>
+            <w:r>
+              <w:rPr>
+                <w:sz w:val="20"/>
+                <w:szCs w:val="20"/>
+                <w:b/>
+              </w:rPr>
+              <w:t xml:space="preserve">适配理由</w:t>
+            </w:r>
+          </w:p>
+        </w:tc>
+        <w:tc>
+          <w:tcPr>
+            <w:tcW w:w="2250" w:type="dxa"/>
+          </w:tcPr>
+          <w:p>
+            <w:pPr>
+              <w:spacing w:before="60" w:after="60"/>
+            </w:pPr>
+            <w:r>
+              <w:rPr>
+                <w:sz w:val="20"/>
+                <w:szCs w:val="20"/>
+                <w:b/>
+              </w:rPr>
+              <w:t xml:space="preserve">优先级</w:t>
+            </w:r>
+          </w:p>
+        </w:tc>
+      </w:tr>
+      <w:tr>
+        <w:tc>
+          <w:tcPr>
+            <w:tcW w:w="2250" w:type="dxa"/>
+          </w:tcPr>
+          <w:p>
+            <w:pPr>
+              <w:spacing w:before="60" w:after="60"/>
+            </w:pPr>
+            <w:r>
+              <w:rPr>
+                <w:sz w:val="20"/>
+                <w:szCs w:val="20"/>
+              </w:rPr>
+              <w:t xml:space="preserve">GEO 专属注册页</w:t>
+            </w:r>
+          </w:p>
+        </w:tc>
+        <w:tc>
+          <w:tcPr>
+            <w:tcW w:w="2250" w:type="dxa"/>
+          </w:tcPr>
+          <w:p>
+            <w:pPr>
+              <w:spacing w:before="60" w:after="60"/>
+            </w:pPr>
+            <w:r>
+              <w:rPr>
+                <w:sz w:val="20"/>
+                <w:szCs w:val="20"/>
+              </w:rPr>
+              <w:t xml:space="preserve">围绕 CRM、Marketing、Sales 三条主题分别建设专属 GEO 承接页，并绑定统一表单字段。</w:t>
+            </w:r>
+          </w:p>
+        </w:tc>
+        <w:tc>
+          <w:tcPr>
+            <w:tcW w:w="2250" w:type="dxa"/>
+          </w:tcPr>
+          <w:p>
+            <w:pPr>
+              <w:spacing w:before="60" w:after="60"/>
+            </w:pPr>
+            <w:r>
+              <w:rPr>
+                <w:sz w:val="20"/>
+                <w:szCs w:val="20"/>
+              </w:rPr>
+              <w:t xml:space="preserve">便于将 AI 触发的高意向需求和普通自然访问分开。</w:t>
+            </w:r>
+          </w:p>
+        </w:tc>
+        <w:tc>
+          <w:tcPr>
+            <w:tcW w:w="2250" w:type="dxa"/>
+          </w:tcPr>
+          <w:p>
+            <w:pPr>
+              <w:spacing w:before="60" w:after="60"/>
+            </w:pPr>
+            <w:r>
+              <w:rPr>
+                <w:sz w:val="20"/>
+                <w:szCs w:val="20"/>
+              </w:rPr>
+              <w:t xml:space="preserve">P0</w:t>
+            </w:r>
+          </w:p>
+        </w:tc>
+      </w:tr>
+      <w:tr>
+        <w:tc>
+          <w:tcPr>
+            <w:tcW w:w="2250" w:type="dxa"/>
+          </w:tcPr>
+          <w:p>
+            <w:pPr>
+              <w:spacing w:before="60" w:after="60"/>
+            </w:pPr>
+            <w:r>
+              <w:rPr>
+                <w:sz w:val="20"/>
+                <w:szCs w:val="20"/>
+              </w:rPr>
+              <w:t xml:space="preserve">表单隐藏字段</w:t>
+            </w:r>
+          </w:p>
+        </w:tc>
+        <w:tc>
+          <w:tcPr>
+            <w:tcW w:w="2250" w:type="dxa"/>
+          </w:tcPr>
+          <w:p>
+            <w:pPr>
+              <w:spacing w:before="60" w:after="60"/>
+            </w:pPr>
+            <w:r>
+              <w:rPr>
+                <w:sz w:val="20"/>
+                <w:szCs w:val="20"/>
+              </w:rPr>
+              <w:t xml:space="preserve">新增 channel_group、ai_platform、keyword_theme、landing_page_id、offer_code。</w:t>
+            </w:r>
+          </w:p>
+        </w:tc>
+        <w:tc>
+          <w:tcPr>
+            <w:tcW w:w="2250" w:type="dxa"/>
+          </w:tcPr>
+          <w:p>
+            <w:pPr>
+              <w:spacing w:before="60" w:after="60"/>
+            </w:pPr>
+            <w:r>
+              <w:rPr>
+                <w:sz w:val="20"/>
+                <w:szCs w:val="20"/>
+              </w:rPr>
+              <w:t xml:space="preserve">为后续注册、激活、升级归因提供主键。</w:t>
+            </w:r>
+          </w:p>
+        </w:tc>
+        <w:tc>
+          <w:tcPr>
+            <w:tcW w:w="2250" w:type="dxa"/>
+          </w:tcPr>
+          <w:p>
+            <w:pPr>
+              <w:spacing w:before="60" w:after="60"/>
+            </w:pPr>
+            <w:r>
+              <w:rPr>
+                <w:sz w:val="20"/>
+                <w:szCs w:val="20"/>
+              </w:rPr>
+              <w:t xml:space="preserve">P0</w:t>
+            </w:r>
+          </w:p>
+        </w:tc>
+      </w:tr>
+      <w:tr>
+        <w:tc>
+          <w:tcPr>
+            <w:tcW w:w="2250" w:type="dxa"/>
+          </w:tcPr>
+          <w:p>
+            <w:pPr>
+              <w:spacing w:before="60" w:after="60"/>
+            </w:pPr>
+            <w:r>
+              <w:rPr>
+                <w:sz w:val="20"/>
+                <w:szCs w:val="20"/>
+              </w:rPr>
+              <w:t xml:space="preserve">AI 专属权益包</w:t>
+            </w:r>
+          </w:p>
+        </w:tc>
+        <w:tc>
+          <w:tcPr>
+            <w:tcW w:w="2250" w:type="dxa"/>
+          </w:tcPr>
+          <w:p>
+            <w:pPr>
+              <w:spacing w:before="60" w:after="60"/>
+            </w:pPr>
+            <w:r>
+              <w:rPr>
+                <w:sz w:val="20"/>
+                <w:szCs w:val="20"/>
+              </w:rPr>
+              <w:t xml:space="preserve">为 AI 流量提供独立模板包、诊断包或试用权益码。</w:t>
+            </w:r>
+          </w:p>
+        </w:tc>
+        <w:tc>
+          <w:tcPr>
+            <w:tcW w:w="2250" w:type="dxa"/>
+          </w:tcPr>
+          <w:p>
+            <w:pPr>
+              <w:spacing w:before="60" w:after="60"/>
+            </w:pPr>
+            <w:r>
+              <w:rPr>
+                <w:sz w:val="20"/>
+                <w:szCs w:val="20"/>
+              </w:rPr>
+              <w:t xml:space="preserve">适合对来源字段缺失做低成本补丁。</w:t>
+            </w:r>
+          </w:p>
+        </w:tc>
+        <w:tc>
+          <w:tcPr>
+            <w:tcW w:w="2250" w:type="dxa"/>
+          </w:tcPr>
+          <w:p>
+            <w:pPr>
+              <w:spacing w:before="60" w:after="60"/>
+            </w:pPr>
+            <w:r>
+              <w:rPr>
+                <w:sz w:val="20"/>
+                <w:szCs w:val="20"/>
+              </w:rPr>
+              <w:t xml:space="preserve">P1</w:t>
+            </w:r>
+          </w:p>
+        </w:tc>
+      </w:tr>
+      <w:tr>
+        <w:tc>
+          <w:tcPr>
+            <w:tcW w:w="2250" w:type="dxa"/>
+          </w:tcPr>
+          <w:p>
+            <w:pPr>
+              <w:spacing w:before="60" w:after="60"/>
+            </w:pPr>
+            <w:r>
+              <w:rPr>
+                <w:sz w:val="20"/>
+                <w:szCs w:val="20"/>
+              </w:rPr>
+              <w:t xml:space="preserve">演示预约分流</w:t>
+            </w:r>
+          </w:p>
+        </w:tc>
+        <w:tc>
+          <w:tcPr>
+            <w:tcW w:w="2250" w:type="dxa"/>
+          </w:tcPr>
+          <w:p>
+            <w:pPr>
+              <w:spacing w:before="60" w:after="60"/>
+            </w:pPr>
+            <w:r>
+              <w:rPr>
+                <w:sz w:val="20"/>
+                <w:szCs w:val="20"/>
+              </w:rPr>
+              <w:t xml:space="preserve">给高意向 GEO 页面加入专属 demo CTA 与日历入口。</w:t>
+            </w:r>
+          </w:p>
+        </w:tc>
+        <w:tc>
+          <w:tcPr>
+            <w:tcW w:w="2250" w:type="dxa"/>
+          </w:tcPr>
+          <w:p>
+            <w:pPr>
+              <w:spacing w:before="60" w:after="60"/>
+            </w:pPr>
+            <w:r>
+              <w:rPr>
+                <w:sz w:val="20"/>
+                <w:szCs w:val="20"/>
+              </w:rPr>
+              <w:t xml:space="preserve">方便把销售协同型转化和自助型注册拆开。</w:t>
+            </w:r>
+          </w:p>
+        </w:tc>
+        <w:tc>
+          <w:tcPr>
+            <w:tcW w:w="2250" w:type="dxa"/>
+          </w:tcPr>
+          <w:p>
+            <w:pPr>
+              <w:spacing w:before="60" w:after="60"/>
+            </w:pPr>
+            <w:r>
+              <w:rPr>
+                <w:sz w:val="20"/>
+                <w:szCs w:val="20"/>
+              </w:rPr>
+              <w:t xml:space="preserve">P1</w:t>
+            </w:r>
+          </w:p>
+        </w:tc>
+      </w:tr>
+    </w:tbl>
+    <w:p>
+      <w:pPr>
+        <w:spacing w:before="180" w:after="120"/>
+      </w:pPr>
+      <w:r>
+        <w:rPr>
+          <w:sz w:val="56"/>
+          <w:szCs w:val="56"/>
+          <w:b/>
+        </w:rPr>
+        <w:t xml:space="preserve">间接效果追踪方案</w:t>
+      </w:r>
+    </w:p>
+    <w:tbl>
+      <w:tblPr>
+        <w:tblW w:w="0" w:type="auto"/>
+        <w:tblBorders>
+          <w:top w:val="single" w:sz="8" w:space="0" w:color="D7DFE8"/>
+          <w:left w:val="single" w:sz="8" w:space="0" w:color="D7DFE8"/>
+          <w:bottom w:val="single" w:sz="8" w:space="0" w:color="D7DFE8"/>
+          <w:right w:val="single" w:sz="8" w:space="0" w:color="D7DFE8"/>
+          <w:insideH w:val="single" w:sz="8" w:space="0" w:color="D7DFE8"/>
+          <w:insideV w:val="single" w:sz="8" w:space="0" w:color="D7DFE8"/>
+        </w:tblBorders>
+      </w:tblPr>
+      <w:tr>
+        <w:tc>
+          <w:tcPr>
+            <w:tcW w:w="1800" w:type="dxa"/>
+          </w:tcPr>
+          <w:p>
+            <w:pPr>
+              <w:spacing w:before="60" w:after="60"/>
+            </w:pPr>
+            <w:r>
+              <w:rPr>
+                <w:sz w:val="20"/>
+                <w:szCs w:val="20"/>
+                <w:b/>
+              </w:rPr>
               <w:t xml:space="preserve">指标</w:t>
             </w:r>
           </w:p>
@@ -1977,6 +2658,353 @@
                 <w:szCs w:val="20"/>
               </w:rPr>
               <w:t xml:space="preserve">用于判断 GEO 是否带来真正业务价值。</w:t>
+            </w:r>
+          </w:p>
+        </w:tc>
+      </w:tr>
+    </w:tbl>
+    <w:p>
+      <w:pPr>
+        <w:spacing w:before="180" w:after="120"/>
+      </w:pPr>
+      <w:r>
+        <w:rPr>
+          <w:sz w:val="56"/>
+          <w:szCs w:val="56"/>
+          <w:b/>
+        </w:rPr>
+        <w:t xml:space="preserve">监测效果边界说明</w:t>
+      </w:r>
+    </w:p>
+    <w:p>
+      <w:pPr>
+        <w:spacing w:before="0" w:after="120"/>
+      </w:pPr>
+      <w:r>
+        <w:rPr>
+          <w:sz w:val="42"/>
+          <w:szCs w:val="42"/>
+        </w:rPr>
+        <w:t xml:space="preserve">即便采用 referer、专属落地页、表单字段和升级回传，GEO 的总价值也无法被后台完整显性统计。更稳妥的做法，是把可见贡献、可部分恢复贡献和暂时不可见贡献拆开解释。</w:t>
+      </w:r>
+    </w:p>
+    <w:p>
+      <w:pPr>
+        <w:spacing w:before="0" w:after="120"/>
+      </w:pPr>
+      <w:r>
+        <w:rPr>
+          <w:sz w:val="42"/>
+          <w:szCs w:val="42"/>
+        </w:rPr>
+        <w:t xml:space="preserve">对于 HubSpot 这类海外官网承接较强的 SaaS，公司官网、注册和升级链路都较标准化，因此可直接观测的 GEO 贡献通常有机会高于一般中国场景；但在项目早期，仍建议把 `20%~30%` 视为保守规划假设，而不是把更高可见度写成必然事实。</w:t>
+      </w:r>
+    </w:p>
+    <w:p>
+      <w:pPr>
+        <w:spacing w:before="0" w:after="120"/>
+      </w:pPr>
+      <w:r>
+        <w:rPr>
+          <w:sz w:val="42"/>
+          <w:szCs w:val="42"/>
+          <w:b/>
+        </w:rPr>
+        <w:t xml:space="preserve">提示：建议把 `20%~30%` 写成保守规划假设：当观测链路成熟时可见比例可能继续提升，但不应把它写成跨行业固定定律，也不应直接套用固定倍数去反推总 ROI。</w:t>
+      </w:r>
+    </w:p>
+    <w:tbl>
+      <w:tblPr>
+        <w:tblW w:w="0" w:type="auto"/>
+        <w:tblBorders>
+          <w:top w:val="single" w:sz="8" w:space="0" w:color="D7DFE8"/>
+          <w:left w:val="single" w:sz="8" w:space="0" w:color="D7DFE8"/>
+          <w:bottom w:val="single" w:sz="8" w:space="0" w:color="D7DFE8"/>
+          <w:right w:val="single" w:sz="8" w:space="0" w:color="D7DFE8"/>
+          <w:insideH w:val="single" w:sz="8" w:space="0" w:color="D7DFE8"/>
+          <w:insideV w:val="single" w:sz="8" w:space="0" w:color="D7DFE8"/>
+        </w:tblBorders>
+      </w:tblPr>
+      <w:tr>
+        <w:tc>
+          <w:tcPr>
+            <w:tcW w:w="2250" w:type="dxa"/>
+          </w:tcPr>
+          <w:p>
+            <w:pPr>
+              <w:spacing w:before="60" w:after="60"/>
+            </w:pPr>
+            <w:r>
+              <w:rPr>
+                <w:sz w:val="20"/>
+                <w:szCs w:val="20"/>
+                <w:b/>
+              </w:rPr>
+              <w:t xml:space="preserve">贡献层</w:t>
+            </w:r>
+          </w:p>
+        </w:tc>
+        <w:tc>
+          <w:tcPr>
+            <w:tcW w:w="2250" w:type="dxa"/>
+          </w:tcPr>
+          <w:p>
+            <w:pPr>
+              <w:spacing w:before="60" w:after="60"/>
+            </w:pPr>
+            <w:r>
+              <w:rPr>
+                <w:sz w:val="20"/>
+                <w:szCs w:val="20"/>
+                <w:b/>
+              </w:rPr>
+              <w:t xml:space="preserve">可见度</w:t>
+            </w:r>
+          </w:p>
+        </w:tc>
+        <w:tc>
+          <w:tcPr>
+            <w:tcW w:w="2250" w:type="dxa"/>
+          </w:tcPr>
+          <w:p>
+            <w:pPr>
+              <w:spacing w:before="60" w:after="60"/>
+            </w:pPr>
+            <w:r>
+              <w:rPr>
+                <w:sz w:val="20"/>
+                <w:szCs w:val="20"/>
+                <w:b/>
+              </w:rPr>
+              <w:t xml:space="preserve">典型信号</w:t>
+            </w:r>
+          </w:p>
+        </w:tc>
+        <w:tc>
+          <w:tcPr>
+            <w:tcW w:w="2250" w:type="dxa"/>
+          </w:tcPr>
+          <w:p>
+            <w:pPr>
+              <w:spacing w:before="60" w:after="60"/>
+            </w:pPr>
+            <w:r>
+              <w:rPr>
+                <w:sz w:val="20"/>
+                <w:szCs w:val="20"/>
+                <w:b/>
+              </w:rPr>
+              <w:t xml:space="preserve">解释边界</w:t>
+            </w:r>
+          </w:p>
+        </w:tc>
+      </w:tr>
+      <w:tr>
+        <w:tc>
+          <w:tcPr>
+            <w:tcW w:w="2250" w:type="dxa"/>
+          </w:tcPr>
+          <w:p>
+            <w:pPr>
+              <w:spacing w:before="60" w:after="60"/>
+            </w:pPr>
+            <w:r>
+              <w:rPr>
+                <w:sz w:val="20"/>
+                <w:szCs w:val="20"/>
+              </w:rPr>
+              <w:t xml:space="preserve">可直接观测层</w:t>
+            </w:r>
+          </w:p>
+        </w:tc>
+        <w:tc>
+          <w:tcPr>
+            <w:tcW w:w="2250" w:type="dxa"/>
+          </w:tcPr>
+          <w:p>
+            <w:pPr>
+              <w:spacing w:before="60" w:after="60"/>
+            </w:pPr>
+            <w:r>
+              <w:rPr>
+                <w:sz w:val="20"/>
+                <w:szCs w:val="20"/>
+              </w:rPr>
+              <w:t xml:space="preserve">中等到较高</w:t>
+            </w:r>
+          </w:p>
+        </w:tc>
+        <w:tc>
+          <w:tcPr>
+            <w:tcW w:w="2250" w:type="dxa"/>
+          </w:tcPr>
+          <w:p>
+            <w:pPr>
+              <w:spacing w:before="60" w:after="60"/>
+            </w:pPr>
+            <w:r>
+              <w:rPr>
+                <w:sz w:val="20"/>
+                <w:szCs w:val="20"/>
+              </w:rPr>
+              <w:t xml:space="preserve">referer、专属页、表单字段、注册、激活、升级回传。</w:t>
+            </w:r>
+          </w:p>
+        </w:tc>
+        <w:tc>
+          <w:tcPr>
+            <w:tcW w:w="2250" w:type="dxa"/>
+          </w:tcPr>
+          <w:p>
+            <w:pPr>
+              <w:spacing w:before="60" w:after="60"/>
+            </w:pPr>
+            <w:r>
+              <w:rPr>
+                <w:sz w:val="20"/>
+                <w:szCs w:val="20"/>
+              </w:rPr>
+              <w:t xml:space="preserve">适合做最硬的 GEO 结果归因，但依旧不能视为总贡献全量。</w:t>
+            </w:r>
+          </w:p>
+        </w:tc>
+      </w:tr>
+      <w:tr>
+        <w:tc>
+          <w:tcPr>
+            <w:tcW w:w="2250" w:type="dxa"/>
+          </w:tcPr>
+          <w:p>
+            <w:pPr>
+              <w:spacing w:before="60" w:after="60"/>
+            </w:pPr>
+            <w:r>
+              <w:rPr>
+                <w:sz w:val="20"/>
+                <w:szCs w:val="20"/>
+              </w:rPr>
+              <w:t xml:space="preserve">可部分恢复层</w:t>
+            </w:r>
+          </w:p>
+        </w:tc>
+        <w:tc>
+          <w:tcPr>
+            <w:tcW w:w="2250" w:type="dxa"/>
+          </w:tcPr>
+          <w:p>
+            <w:pPr>
+              <w:spacing w:before="60" w:after="60"/>
+            </w:pPr>
+            <w:r>
+              <w:rPr>
+                <w:sz w:val="20"/>
+                <w:szCs w:val="20"/>
+              </w:rPr>
+              <w:t xml:space="preserve">中等</w:t>
+            </w:r>
+          </w:p>
+        </w:tc>
+        <w:tc>
+          <w:tcPr>
+            <w:tcW w:w="2250" w:type="dxa"/>
+          </w:tcPr>
+          <w:p>
+            <w:pPr>
+              <w:spacing w:before="60" w:after="60"/>
+            </w:pPr>
+            <w:r>
+              <w:rPr>
+                <w:sz w:val="20"/>
+                <w:szCs w:val="20"/>
+              </w:rPr>
+              <w:t xml:space="preserve">自报来源、销售反馈、品牌词后续访问、跨页行为。</w:t>
+            </w:r>
+          </w:p>
+        </w:tc>
+        <w:tc>
+          <w:tcPr>
+            <w:tcW w:w="2250" w:type="dxa"/>
+          </w:tcPr>
+          <w:p>
+            <w:pPr>
+              <w:spacing w:before="60" w:after="60"/>
+            </w:pPr>
+            <w:r>
+              <w:rPr>
+                <w:sz w:val="20"/>
+                <w:szCs w:val="20"/>
+              </w:rPr>
+              <w:t xml:space="preserve">更适合做趋势校准和渠道解释，不能单独证明 GEO 成交。</w:t>
+            </w:r>
+          </w:p>
+        </w:tc>
+      </w:tr>
+      <w:tr>
+        <w:tc>
+          <w:tcPr>
+            <w:tcW w:w="2250" w:type="dxa"/>
+          </w:tcPr>
+          <w:p>
+            <w:pPr>
+              <w:spacing w:before="60" w:after="60"/>
+            </w:pPr>
+            <w:r>
+              <w:rPr>
+                <w:sz w:val="20"/>
+                <w:szCs w:val="20"/>
+              </w:rPr>
+              <w:t xml:space="preserve">暂时不可观测层</w:t>
+            </w:r>
+          </w:p>
+        </w:tc>
+        <w:tc>
+          <w:tcPr>
+            <w:tcW w:w="2250" w:type="dxa"/>
+          </w:tcPr>
+          <w:p>
+            <w:pPr>
+              <w:spacing w:before="60" w:after="60"/>
+            </w:pPr>
+            <w:r>
+              <w:rPr>
+                <w:sz w:val="20"/>
+                <w:szCs w:val="20"/>
+              </w:rPr>
+              <w:t xml:space="preserve">低</w:t>
+            </w:r>
+          </w:p>
+        </w:tc>
+        <w:tc>
+          <w:tcPr>
+            <w:tcW w:w="2250" w:type="dxa"/>
+          </w:tcPr>
+          <w:p>
+            <w:pPr>
+              <w:spacing w:before="60" w:after="60"/>
+            </w:pPr>
+            <w:r>
+              <w:rPr>
+                <w:sz w:val="20"/>
+                <w:szCs w:val="20"/>
+              </w:rPr>
+              <w:t xml:space="preserve">AI 背书带来的品牌信任提升、后续顾虑下降、长周期成交效率改善。</w:t>
+            </w:r>
+          </w:p>
+        </w:tc>
+        <w:tc>
+          <w:tcPr>
+            <w:tcW w:w="2250" w:type="dxa"/>
+          </w:tcPr>
+          <w:p>
+            <w:pPr>
+              <w:spacing w:before="60" w:after="60"/>
+            </w:pPr>
+            <w:r>
+              <w:rPr>
+                <w:sz w:val="20"/>
+                <w:szCs w:val="20"/>
+              </w:rPr>
+              <w:t xml:space="preserve">只能通过品牌词、线索质量和成交效率的长期变化间接理解。</w:t>
             </w:r>
           </w:p>
         </w:tc>

</xml_diff>

<commit_message>
add observability estimation framework
</commit_message>
<xml_diff>
--- a/skills/geo-tracking-plan/examples/hubspot-demo/hubspot-geo-tracking-plan.docx
+++ b/skills/geo-tracking-plan/examples/hubspot-demo/hubspot-geo-tracking-plan.docx
@@ -3005,6 +3005,663 @@
                 <w:szCs w:val="20"/>
               </w:rPr>
               <w:t xml:space="preserve">只能通过品牌词、线索质量和成交效率的长期变化间接理解。</w:t>
+            </w:r>
+          </w:p>
+        </w:tc>
+      </w:tr>
+    </w:tbl>
+    <w:p>
+      <w:pPr>
+        <w:spacing w:before="180" w:after="120"/>
+      </w:pPr>
+      <w:r>
+        <w:rPr>
+          <w:sz w:val="56"/>
+          <w:szCs w:val="56"/>
+          <w:b/>
+        </w:rPr>
+        <w:t xml:space="preserve">可观测性估算框架</w:t>
+      </w:r>
+    </w:p>
+    <w:p>
+      <w:pPr>
+        <w:spacing w:before="0" w:after="120"/>
+      </w:pPr>
+      <w:r>
+        <w:rPr>
+          <w:sz w:val="42"/>
+          <w:szCs w:val="42"/>
+        </w:rPr>
+        <w:t xml:space="preserve">基于 HubSpot 这类海外 SaaS 的官网承接能力、表单字段可塑性、注册与升级链路标准化程度，当前更适合采用三层规划视图：先用可直接观测层校准方向，再用可部分恢复层增强解释力，最后保留不可观测层来容纳 AI 背书和品牌长期效应。</w:t>
+      </w:r>
+    </w:p>
+    <w:p>
+      <w:pPr>
+        <w:spacing w:before="0" w:after="120"/>
+      </w:pPr>
+      <w:r>
+        <w:rPr>
+          <w:sz w:val="42"/>
+          <w:szCs w:val="42"/>
+        </w:rPr>
+        <w:t xml:space="preserve">以下分配不是经营结果，只是当前方案阶段的规划值。随着 landing_page_id、ai_platform、keyword_theme、activation_status 和升级回传链路更稳定，Observed 的占比有机会继续提升。</w:t>
+      </w:r>
+    </w:p>
+    <w:p>
+      <w:pPr>
+        <w:spacing w:before="0" w:after="120"/>
+      </w:pPr>
+      <w:r>
+        <w:rPr>
+          <w:sz w:val="42"/>
+          <w:szCs w:val="42"/>
+          <w:b/>
+        </w:rPr>
+        <w:t xml:space="preserve">提示：三层规划值合计为 100%，目的是帮助团队解释“看得见的贡献”和“尚未完全看见的贡献”之间的关系，而不是把这组数值当成财务结算口径。</w:t>
+      </w:r>
+    </w:p>
+    <w:p>
+      <w:pPr>
+        <w:spacing w:before="0" w:after="100"/>
+      </w:pPr>
+      <w:r>
+        <w:rPr>
+          <w:sz w:val="44"/>
+          <w:szCs w:val="44"/>
+          <w:b/>
+        </w:rPr>
+        <w:t xml:space="preserve">Observed / Recoverable / Unobservable 规划分配</w:t>
+      </w:r>
+    </w:p>
+    <w:tbl>
+      <w:tblPr>
+        <w:tblW w:w="0" w:type="auto"/>
+        <w:tblBorders>
+          <w:top w:val="single" w:sz="8" w:space="0" w:color="D7DFE8"/>
+          <w:left w:val="single" w:sz="8" w:space="0" w:color="D7DFE8"/>
+          <w:bottom w:val="single" w:sz="8" w:space="0" w:color="D7DFE8"/>
+          <w:right w:val="single" w:sz="8" w:space="0" w:color="D7DFE8"/>
+          <w:insideH w:val="single" w:sz="8" w:space="0" w:color="D7DFE8"/>
+          <w:insideV w:val="single" w:sz="8" w:space="0" w:color="D7DFE8"/>
+        </w:tblBorders>
+      </w:tblPr>
+      <w:tr>
+        <w:tc>
+          <w:tcPr>
+            <w:tcW w:w="2250" w:type="dxa"/>
+          </w:tcPr>
+          <w:p>
+            <w:pPr>
+              <w:spacing w:before="60" w:after="60"/>
+            </w:pPr>
+            <w:r>
+              <w:rPr>
+                <w:sz w:val="20"/>
+                <w:szCs w:val="20"/>
+                <w:b/>
+              </w:rPr>
+              <w:t xml:space="preserve">层级</w:t>
+            </w:r>
+          </w:p>
+        </w:tc>
+        <w:tc>
+          <w:tcPr>
+            <w:tcW w:w="2250" w:type="dxa"/>
+          </w:tcPr>
+          <w:p>
+            <w:pPr>
+              <w:spacing w:before="60" w:after="60"/>
+            </w:pPr>
+            <w:r>
+              <w:rPr>
+                <w:sz w:val="20"/>
+                <w:szCs w:val="20"/>
+                <w:b/>
+              </w:rPr>
+              <w:t xml:space="preserve">规划值</w:t>
+            </w:r>
+          </w:p>
+        </w:tc>
+        <w:tc>
+          <w:tcPr>
+            <w:tcW w:w="2250" w:type="dxa"/>
+          </w:tcPr>
+          <w:p>
+            <w:pPr>
+              <w:spacing w:before="60" w:after="60"/>
+            </w:pPr>
+            <w:r>
+              <w:rPr>
+                <w:sz w:val="20"/>
+                <w:szCs w:val="20"/>
+                <w:b/>
+              </w:rPr>
+              <w:t xml:space="preserve">建议区间</w:t>
+            </w:r>
+          </w:p>
+        </w:tc>
+        <w:tc>
+          <w:tcPr>
+            <w:tcW w:w="2250" w:type="dxa"/>
+          </w:tcPr>
+          <w:p>
+            <w:pPr>
+              <w:spacing w:before="60" w:after="60"/>
+            </w:pPr>
+            <w:r>
+              <w:rPr>
+                <w:sz w:val="20"/>
+                <w:szCs w:val="20"/>
+                <w:b/>
+              </w:rPr>
+              <w:t xml:space="preserve">说明</w:t>
+            </w:r>
+          </w:p>
+        </w:tc>
+      </w:tr>
+      <w:tr>
+        <w:tc>
+          <w:tcPr>
+            <w:tcW w:w="2250" w:type="dxa"/>
+          </w:tcPr>
+          <w:p>
+            <w:pPr>
+              <w:spacing w:before="60" w:after="60"/>
+            </w:pPr>
+            <w:r>
+              <w:rPr>
+                <w:sz w:val="20"/>
+                <w:szCs w:val="20"/>
+              </w:rPr>
+              <w:t xml:space="preserve">Observed</w:t>
+            </w:r>
+          </w:p>
+        </w:tc>
+        <w:tc>
+          <w:tcPr>
+            <w:tcW w:w="2250" w:type="dxa"/>
+          </w:tcPr>
+          <w:p>
+            <w:pPr>
+              <w:spacing w:before="60" w:after="60"/>
+            </w:pPr>
+            <w:r>
+              <w:rPr>
+                <w:sz w:val="20"/>
+                <w:szCs w:val="20"/>
+              </w:rPr>
+              <w:t xml:space="preserve">35%</w:t>
+            </w:r>
+          </w:p>
+        </w:tc>
+        <w:tc>
+          <w:tcPr>
+            <w:tcW w:w="2250" w:type="dxa"/>
+          </w:tcPr>
+          <w:p>
+            <w:pPr>
+              <w:spacing w:before="60" w:after="60"/>
+            </w:pPr>
+            <w:r>
+              <w:rPr>
+                <w:sz w:val="20"/>
+                <w:szCs w:val="20"/>
+              </w:rPr>
+              <w:t xml:space="preserve">30%~40%</w:t>
+            </w:r>
+          </w:p>
+        </w:tc>
+        <w:tc>
+          <w:tcPr>
+            <w:tcW w:w="2250" w:type="dxa"/>
+          </w:tcPr>
+          <w:p>
+            <w:pPr>
+              <w:spacing w:before="60" w:after="60"/>
+            </w:pPr>
+            <w:r>
+              <w:rPr>
+                <w:sz w:val="20"/>
+                <w:szCs w:val="20"/>
+              </w:rPr>
+              <w:t xml:space="preserve">依赖官网页矩阵、表单字段、注册与升级回传，适合做最硬的 GEO 结果校准。</w:t>
+            </w:r>
+          </w:p>
+        </w:tc>
+      </w:tr>
+      <w:tr>
+        <w:tc>
+          <w:tcPr>
+            <w:tcW w:w="2250" w:type="dxa"/>
+          </w:tcPr>
+          <w:p>
+            <w:pPr>
+              <w:spacing w:before="60" w:after="60"/>
+            </w:pPr>
+            <w:r>
+              <w:rPr>
+                <w:sz w:val="20"/>
+                <w:szCs w:val="20"/>
+              </w:rPr>
+              <w:t xml:space="preserve">Recoverable</w:t>
+            </w:r>
+          </w:p>
+        </w:tc>
+        <w:tc>
+          <w:tcPr>
+            <w:tcW w:w="2250" w:type="dxa"/>
+          </w:tcPr>
+          <w:p>
+            <w:pPr>
+              <w:spacing w:before="60" w:after="60"/>
+            </w:pPr>
+            <w:r>
+              <w:rPr>
+                <w:sz w:val="20"/>
+                <w:szCs w:val="20"/>
+              </w:rPr>
+              <w:t xml:space="preserve">25%</w:t>
+            </w:r>
+          </w:p>
+        </w:tc>
+        <w:tc>
+          <w:tcPr>
+            <w:tcW w:w="2250" w:type="dxa"/>
+          </w:tcPr>
+          <w:p>
+            <w:pPr>
+              <w:spacing w:before="60" w:after="60"/>
+            </w:pPr>
+            <w:r>
+              <w:rPr>
+                <w:sz w:val="20"/>
+                <w:szCs w:val="20"/>
+              </w:rPr>
+              <w:t xml:space="preserve">20%~30%</w:t>
+            </w:r>
+          </w:p>
+        </w:tc>
+        <w:tc>
+          <w:tcPr>
+            <w:tcW w:w="2250" w:type="dxa"/>
+          </w:tcPr>
+          <w:p>
+            <w:pPr>
+              <w:spacing w:before="60" w:after="60"/>
+            </w:pPr>
+            <w:r>
+              <w:rPr>
+                <w:sz w:val="20"/>
+                <w:szCs w:val="20"/>
+              </w:rPr>
+              <w:t xml:space="preserve">依赖自报来源、销售反馈和跨页行为解释，用来增强而不是替代强归因。</w:t>
+            </w:r>
+          </w:p>
+        </w:tc>
+      </w:tr>
+      <w:tr>
+        <w:tc>
+          <w:tcPr>
+            <w:tcW w:w="2250" w:type="dxa"/>
+          </w:tcPr>
+          <w:p>
+            <w:pPr>
+              <w:spacing w:before="60" w:after="60"/>
+            </w:pPr>
+            <w:r>
+              <w:rPr>
+                <w:sz w:val="20"/>
+                <w:szCs w:val="20"/>
+              </w:rPr>
+              <w:t xml:space="preserve">Unobservable</w:t>
+            </w:r>
+          </w:p>
+        </w:tc>
+        <w:tc>
+          <w:tcPr>
+            <w:tcW w:w="2250" w:type="dxa"/>
+          </w:tcPr>
+          <w:p>
+            <w:pPr>
+              <w:spacing w:before="60" w:after="60"/>
+            </w:pPr>
+            <w:r>
+              <w:rPr>
+                <w:sz w:val="20"/>
+                <w:szCs w:val="20"/>
+              </w:rPr>
+              <w:t xml:space="preserve">40%</w:t>
+            </w:r>
+          </w:p>
+        </w:tc>
+        <w:tc>
+          <w:tcPr>
+            <w:tcW w:w="2250" w:type="dxa"/>
+          </w:tcPr>
+          <w:p>
+            <w:pPr>
+              <w:spacing w:before="60" w:after="60"/>
+            </w:pPr>
+            <w:r>
+              <w:rPr>
+                <w:sz w:val="20"/>
+                <w:szCs w:val="20"/>
+              </w:rPr>
+              <w:t xml:space="preserve">30%~45%</w:t>
+            </w:r>
+          </w:p>
+        </w:tc>
+        <w:tc>
+          <w:tcPr>
+            <w:tcW w:w="2250" w:type="dxa"/>
+          </w:tcPr>
+          <w:p>
+            <w:pPr>
+              <w:spacing w:before="60" w:after="60"/>
+            </w:pPr>
+            <w:r>
+              <w:rPr>
+                <w:sz w:val="20"/>
+                <w:szCs w:val="20"/>
+              </w:rPr>
+              <w:t xml:space="preserve">主要容纳 AI 背书带来的品牌信任与长周期成交效率改善。</w:t>
+            </w:r>
+          </w:p>
+        </w:tc>
+      </w:tr>
+    </w:tbl>
+    <w:tbl>
+      <w:tblPr>
+        <w:tblW w:w="0" w:type="auto"/>
+        <w:tblBorders>
+          <w:top w:val="single" w:sz="8" w:space="0" w:color="D7DFE8"/>
+          <w:left w:val="single" w:sz="8" w:space="0" w:color="D7DFE8"/>
+          <w:bottom w:val="single" w:sz="8" w:space="0" w:color="D7DFE8"/>
+          <w:right w:val="single" w:sz="8" w:space="0" w:color="D7DFE8"/>
+          <w:insideH w:val="single" w:sz="8" w:space="0" w:color="D7DFE8"/>
+          <w:insideV w:val="single" w:sz="8" w:space="0" w:color="D7DFE8"/>
+        </w:tblBorders>
+      </w:tblPr>
+      <w:tr>
+        <w:tc>
+          <w:tcPr>
+            <w:tcW w:w="2250" w:type="dxa"/>
+          </w:tcPr>
+          <w:p>
+            <w:pPr>
+              <w:spacing w:before="60" w:after="60"/>
+            </w:pPr>
+            <w:r>
+              <w:rPr>
+                <w:sz w:val="20"/>
+                <w:szCs w:val="20"/>
+                <w:b/>
+              </w:rPr>
+              <w:t xml:space="preserve">层级</w:t>
+            </w:r>
+          </w:p>
+        </w:tc>
+        <w:tc>
+          <w:tcPr>
+            <w:tcW w:w="2250" w:type="dxa"/>
+          </w:tcPr>
+          <w:p>
+            <w:pPr>
+              <w:spacing w:before="60" w:after="60"/>
+            </w:pPr>
+            <w:r>
+              <w:rPr>
+                <w:sz w:val="20"/>
+                <w:szCs w:val="20"/>
+                <w:b/>
+              </w:rPr>
+              <w:t xml:space="preserve">当前规划值</w:t>
+            </w:r>
+          </w:p>
+        </w:tc>
+        <w:tc>
+          <w:tcPr>
+            <w:tcW w:w="2250" w:type="dxa"/>
+          </w:tcPr>
+          <w:p>
+            <w:pPr>
+              <w:spacing w:before="60" w:after="60"/>
+            </w:pPr>
+            <w:r>
+              <w:rPr>
+                <w:sz w:val="20"/>
+                <w:szCs w:val="20"/>
+                <w:b/>
+              </w:rPr>
+              <w:t xml:space="preserve">适用前提</w:t>
+            </w:r>
+          </w:p>
+        </w:tc>
+        <w:tc>
+          <w:tcPr>
+            <w:tcW w:w="2250" w:type="dxa"/>
+          </w:tcPr>
+          <w:p>
+            <w:pPr>
+              <w:spacing w:before="60" w:after="60"/>
+            </w:pPr>
+            <w:r>
+              <w:rPr>
+                <w:sz w:val="20"/>
+                <w:szCs w:val="20"/>
+                <w:b/>
+              </w:rPr>
+              <w:t xml:space="preserve">下一步校准动作</w:t>
+            </w:r>
+          </w:p>
+        </w:tc>
+      </w:tr>
+      <w:tr>
+        <w:tc>
+          <w:tcPr>
+            <w:tcW w:w="2250" w:type="dxa"/>
+          </w:tcPr>
+          <w:p>
+            <w:pPr>
+              <w:spacing w:before="60" w:after="60"/>
+            </w:pPr>
+            <w:r>
+              <w:rPr>
+                <w:sz w:val="20"/>
+                <w:szCs w:val="20"/>
+              </w:rPr>
+              <w:t xml:space="preserve">Observed</w:t>
+            </w:r>
+          </w:p>
+        </w:tc>
+        <w:tc>
+          <w:tcPr>
+            <w:tcW w:w="2250" w:type="dxa"/>
+          </w:tcPr>
+          <w:p>
+            <w:pPr>
+              <w:spacing w:before="60" w:after="60"/>
+            </w:pPr>
+            <w:r>
+              <w:rPr>
+                <w:sz w:val="20"/>
+                <w:szCs w:val="20"/>
+              </w:rPr>
+              <w:t xml:space="preserve">35%</w:t>
+            </w:r>
+          </w:p>
+        </w:tc>
+        <w:tc>
+          <w:tcPr>
+            <w:tcW w:w="2250" w:type="dxa"/>
+          </w:tcPr>
+          <w:p>
+            <w:pPr>
+              <w:spacing w:before="60" w:after="60"/>
+            </w:pPr>
+            <w:r>
+              <w:rPr>
+                <w:sz w:val="20"/>
+                <w:szCs w:val="20"/>
+              </w:rPr>
+              <w:t xml:space="preserve">专属 GEO 注册页、字段字典、注册与激活事件都能稳定回传。</w:t>
+            </w:r>
+          </w:p>
+        </w:tc>
+        <w:tc>
+          <w:tcPr>
+            <w:tcW w:w="2250" w:type="dxa"/>
+          </w:tcPr>
+          <w:p>
+            <w:pPr>
+              <w:spacing w:before="60" w:after="60"/>
+            </w:pPr>
+            <w:r>
+              <w:rPr>
+                <w:sz w:val="20"/>
+                <w:szCs w:val="20"/>
+              </w:rPr>
+              <w:t xml:space="preserve">继续打通升级回传和 demo 预约分流。</w:t>
+            </w:r>
+          </w:p>
+        </w:tc>
+      </w:tr>
+      <w:tr>
+        <w:tc>
+          <w:tcPr>
+            <w:tcW w:w="2250" w:type="dxa"/>
+          </w:tcPr>
+          <w:p>
+            <w:pPr>
+              <w:spacing w:before="60" w:after="60"/>
+            </w:pPr>
+            <w:r>
+              <w:rPr>
+                <w:sz w:val="20"/>
+                <w:szCs w:val="20"/>
+              </w:rPr>
+              <w:t xml:space="preserve">Recoverable</w:t>
+            </w:r>
+          </w:p>
+        </w:tc>
+        <w:tc>
+          <w:tcPr>
+            <w:tcW w:w="2250" w:type="dxa"/>
+          </w:tcPr>
+          <w:p>
+            <w:pPr>
+              <w:spacing w:before="60" w:after="60"/>
+            </w:pPr>
+            <w:r>
+              <w:rPr>
+                <w:sz w:val="20"/>
+                <w:szCs w:val="20"/>
+              </w:rPr>
+              <w:t xml:space="preserve">25%</w:t>
+            </w:r>
+          </w:p>
+        </w:tc>
+        <w:tc>
+          <w:tcPr>
+            <w:tcW w:w="2250" w:type="dxa"/>
+          </w:tcPr>
+          <w:p>
+            <w:pPr>
+              <w:spacing w:before="60" w:after="60"/>
+            </w:pPr>
+            <w:r>
+              <w:rPr>
+                <w:sz w:val="20"/>
+                <w:szCs w:val="20"/>
+              </w:rPr>
+              <w:t xml:space="preserve">销售反馈、自报来源和跨页行为可被标准化记录。</w:t>
+            </w:r>
+          </w:p>
+        </w:tc>
+        <w:tc>
+          <w:tcPr>
+            <w:tcW w:w="2250" w:type="dxa"/>
+          </w:tcPr>
+          <w:p>
+            <w:pPr>
+              <w:spacing w:before="60" w:after="60"/>
+            </w:pPr>
+            <w:r>
+              <w:rPr>
+                <w:sz w:val="20"/>
+                <w:szCs w:val="20"/>
+              </w:rPr>
+              <w:t xml:space="preserve">补统一问卷口径，减少不同团队记录方式差异。</w:t>
+            </w:r>
+          </w:p>
+        </w:tc>
+      </w:tr>
+      <w:tr>
+        <w:tc>
+          <w:tcPr>
+            <w:tcW w:w="2250" w:type="dxa"/>
+          </w:tcPr>
+          <w:p>
+            <w:pPr>
+              <w:spacing w:before="60" w:after="60"/>
+            </w:pPr>
+            <w:r>
+              <w:rPr>
+                <w:sz w:val="20"/>
+                <w:szCs w:val="20"/>
+              </w:rPr>
+              <w:t xml:space="preserve">Unobservable</w:t>
+            </w:r>
+          </w:p>
+        </w:tc>
+        <w:tc>
+          <w:tcPr>
+            <w:tcW w:w="2250" w:type="dxa"/>
+          </w:tcPr>
+          <w:p>
+            <w:pPr>
+              <w:spacing w:before="60" w:after="60"/>
+            </w:pPr>
+            <w:r>
+              <w:rPr>
+                <w:sz w:val="20"/>
+                <w:szCs w:val="20"/>
+              </w:rPr>
+              <w:t xml:space="preserve">40%</w:t>
+            </w:r>
+          </w:p>
+        </w:tc>
+        <w:tc>
+          <w:tcPr>
+            <w:tcW w:w="2250" w:type="dxa"/>
+          </w:tcPr>
+          <w:p>
+            <w:pPr>
+              <w:spacing w:before="60" w:after="60"/>
+            </w:pPr>
+            <w:r>
+              <w:rPr>
+                <w:sz w:val="20"/>
+                <w:szCs w:val="20"/>
+              </w:rPr>
+              <w:t xml:space="preserve">AI 背书更多体现在品牌心智、默认候选和后续成交效率改善。</w:t>
+            </w:r>
+          </w:p>
+        </w:tc>
+        <w:tc>
+          <w:tcPr>
+            <w:tcW w:w="2250" w:type="dxa"/>
+          </w:tcPr>
+          <w:p>
+            <w:pPr>
+              <w:spacing w:before="60" w:after="60"/>
+            </w:pPr>
+            <w:r>
+              <w:rPr>
+                <w:sz w:val="20"/>
+                <w:szCs w:val="20"/>
+              </w:rPr>
+              <w:t xml:space="preserve">联合品牌词、线索质量和销售周期一起做季度复盘。</w:t>
             </w:r>
           </w:p>
         </w:tc>

</xml_diff>